<commit_message>
publish student projects (Fall 2026) 2026-09-22 21:13
</commit_message>
<xml_diff>
--- a/Immersive-Experience/octonav.docx
+++ b/Immersive-Experience/octonav.docx
@@ -2625,7 +2625,49 @@
         <w:t xml:space="preserve"> </w:t>
       </w:r>
       <w:r>
-        <w:t xml:space="preserve">6 CS + 2 Design + 1 Art (9) — because the campus</w:t>
+        <w:t xml:space="preserve">6 CS + 2 Design + 0 Art (8) — the</w:t>
+      </w:r>
+      <w:r>
+        <w:t xml:space="preserve"> </w:t>
+      </w:r>
+      <w:r>
+        <w:rPr>
+          <w:b/>
+        </w:rPr>
+        <w:t xml:space="preserve">wayfinding UX is the dominant surface</w:t>
+      </w:r>
+      <w:r>
+        <w:t xml:space="preserve"> </w:t>
+      </w:r>
+      <w:r>
+        <w:t xml:space="preserve">(destination/mobility selection, multi-floor route legibility, the crowdsourced-report flow, accessibility conditional routing, onboarding), so two designers own the design + UI/UX (rules: min 1 Design mandated, max 9 total, D+A ≤ 3; see</w:t>
+      </w:r>
+      <w:r>
+        <w:t xml:space="preserve"> </w:t>
+      </w:r>
+      <w:r>
+        <w:rPr>
+          <w:rStyle w:val="VerbatimChar"/>
+        </w:rPr>
+        <w:t xml:space="preserve">team-formation.pdf</w:t>
+      </w:r>
+      <w:r>
+        <w:t xml:space="preserve">).</w:t>
+      </w:r>
+      <w:r>
+        <w:t xml:space="preserve"> </w:t>
+      </w:r>
+      <w:r>
+        <w:rPr>
+          <w:b/>
+        </w:rPr>
+        <w:t xml:space="preserve">Art-risk flag:</w:t>
+      </w:r>
+      <w:r>
+        <w:t xml:space="preserve"> </w:t>
+      </w:r>
+      <w:r>
+        <w:t xml:space="preserve">even though the campus</w:t>
       </w:r>
       <w:r>
         <w:t xml:space="preserve"> </w:t>
@@ -2637,34 +2679,37 @@
         <w:t xml:space="preserve">geometry is LiDAR-captured rather than hand-modelled</w:t>
       </w:r>
       <w:r>
-        <w:t xml:space="preserve">, the art surface is smaller than a typical Immersive Experience (visual style, materials/lighting, wayfinding iconography and UI), so one artist can carry it; the</w:t>
-      </w:r>
-      <w:r>
-        <w:t xml:space="preserve"> </w:t>
-      </w:r>
-      <w:r>
-        <w:rPr>
-          <w:b/>
-        </w:rPr>
-        <w:t xml:space="preserve">wayfinding UX is the larger surface</w:t>
-      </w:r>
-      <w:r>
-        <w:t xml:space="preserve"> </w:t>
-      </w:r>
-      <w:r>
-        <w:t xml:space="preserve">(destination/mobility selection, multi-floor route legibility, the crowdsourced-report flow, accessibility conditional routing, onboarding), so two designers own the design + UI/UX (rules: min 1 Design mandated, max 9 total, D+A ≤ 3; see</w:t>
-      </w:r>
-      <w:r>
-        <w:t xml:space="preserve"> </w:t>
-      </w:r>
-      <w:r>
-        <w:rPr>
-          <w:rStyle w:val="VerbatimChar"/>
-        </w:rPr>
-        <w:t xml:space="preserve">team-formation.pdf</w:t>
-      </w:r>
-      <w:r>
-        <w:t xml:space="preserve">). If the visual/material polish per floor outgrows one artist, trade the 2nd designer for a 2nd artist. Note: for Immersive Experience the audio floor is lighter (ambient + UI cues) — a lecturer waiver on heavy BGM may apply for a utility wayfinding app.</w:t>
+        <w:t xml:space="preserve"> </w:t>
+      </w:r>
+      <w:r>
+        <w:t xml:space="preserve">(which shrinks the art surface), there is still a real art payload — the 2.5D/3D visual style, materials/lighting, wayfinding iconography, route/marker/obstruction VFX and UI art — so</w:t>
+      </w:r>
+      <w:r>
+        <w:t xml:space="preserve"> </w:t>
+      </w:r>
+      <w:r>
+        <w:rPr>
+          <w:b/>
+        </w:rPr>
+        <w:t xml:space="preserve">0 artists is a risk</w:t>
+      </w:r>
+      <w:r>
+        <w:t xml:space="preserve">; with no artist, that surface is owned by the designers through the</w:t>
+      </w:r>
+      <w:r>
+        <w:t xml:space="preserve"> </w:t>
+      </w:r>
+      <w:r>
+        <w:rPr>
+          <w:b/>
+        </w:rPr>
+        <w:t xml:space="preserve">D11 conditional</w:t>
+      </w:r>
+      <w:r>
+        <w:t xml:space="preserve"> </w:t>
+      </w:r>
+      <w:r>
+        <w:t xml:space="preserve">(Art Proof of Concept M1 / Art Implementation Quality M2, the last Design goal each milestone), and art must be scoped hard (a clean visual style + a tight icon/UI set, placeholder-free but minimal) or the team should add an artist within D+A ≤ 3. Note: for Immersive Experience the audio floor is lighter (ambient + UI cues) — a lecturer waiver on heavy BGM may apply for a utility wayfinding app.</w:t>
       </w:r>
     </w:p>
     <w:p>
@@ -2756,7 +2801,7 @@
         <w:pStyle w:val="Compact"/>
       </w:pPr>
       <w:r>
-        <w:t xml:space="preserve">M1D7 Reactivity Model (mapping live crowd density / obstruction reports to routing responses — reroute thresholds, warning states — as tunable parameters)</w:t>
+        <w:t xml:space="preserve">M1D11 Art Proof of Concept (conditional — 0-artist team, Design-owned): the visual direction — 2.5D/3D campus style, materials/lighting, wayfinding iconography, route/marker/obstruction VFX and UI art; 2 mockup screens</w:t>
       </w:r>
     </w:p>
     <w:p>
@@ -2819,7 +2864,7 @@
         <w:pStyle w:val="Compact"/>
       </w:pPr>
       <w:r>
-        <w:t xml:space="preserve">M2D7 Reactivity Tuning (the crowd-density / obstruction thresholds that trigger rerouting, tuned from observation)</w:t>
+        <w:t xml:space="preserve">M2D11 Art Implementation Quality (conditional — 0-artist team, Design-owned): all in-app art implemented in-engine, no placeholders — the campus style/materials/lighting per floor, wayfinding iconography, route/marker/obstruction VFX and UI art</w:t>
       </w:r>
     </w:p>
     <w:p>
@@ -2954,49 +2999,67 @@
         <w:rPr>
           <w:b/>
         </w:rPr>
-        <w:t xml:space="preserve">Art M1:</w:t>
-      </w:r>
-      <w:r>
-        <w:t xml:space="preserve"> </w:t>
-      </w:r>
-      <w:r>
-        <w:t xml:space="preserve">1 artist (geometry is LiDAR-captured, so style + iconography + UI are the art payload)</w:t>
-      </w:r>
-    </w:p>
-    <w:p>
-      <w:pPr>
-        <w:numPr>
-          <w:ilvl w:val="1"/>
-          <w:numId w:val="1022"/>
-        </w:numPr>
-        <w:pStyle w:val="Compact"/>
-      </w:pPr>
-      <w:r>
-        <w:t xml:space="preserve">M1A1 ⭐ Art Bible / Proof of Concept (the campus visual direction — palette, material/lighting look for the 2.5D/3D view, wayfinding iconography)</w:t>
-      </w:r>
-    </w:p>
-    <w:p>
-      <w:pPr>
-        <w:numPr>
-          <w:ilvl w:val="1"/>
-          <w:numId w:val="1022"/>
-        </w:numPr>
-        <w:pStyle w:val="Compact"/>
-      </w:pPr>
-      <w:r>
-        <w:t xml:space="preserve">M1A3 Environment, Props &amp; VFX Concepts (the campus material/lighting styling, route/marker and obstruction VFX)</w:t>
-      </w:r>
-    </w:p>
-    <w:p>
-      <w:pPr>
-        <w:numPr>
-          <w:ilvl w:val="1"/>
-          <w:numId w:val="1022"/>
-        </w:numPr>
-        <w:pStyle w:val="Compact"/>
-      </w:pPr>
-      <w:r>
-        <w:t xml:space="preserve">M1A4 UI Art Concepts &amp; Typography (bottom-tab shell, destination/mobility UI, route + accessibility iconography)</w:t>
+        <w:t xml:space="preserve">Art:</w:t>
+      </w:r>
+      <w:r>
+        <w:t xml:space="preserve"> </w:t>
+      </w:r>
+      <w:r>
+        <w:rPr>
+          <w:i/>
+        </w:rPr>
+        <w:t xml:space="preserve">no artist on this team (0 Art).</w:t>
+      </w:r>
+      <w:r>
+        <w:t xml:space="preserve"> </w:t>
+      </w:r>
+      <w:r>
+        <w:t xml:space="preserve">The art surface (2.5D/3D campus style, materials/lighting, wayfinding iconography, route/marker/obstruction VFX and UI art) is owned by the designers through the</w:t>
+      </w:r>
+      <w:r>
+        <w:t xml:space="preserve"> </w:t>
+      </w:r>
+      <w:r>
+        <w:rPr>
+          <w:b/>
+        </w:rPr>
+        <w:t xml:space="preserve">D11 conditional</w:t>
+      </w:r>
+      <w:r>
+        <w:t xml:space="preserve"> </w:t>
+      </w:r>
+      <w:r>
+        <w:t xml:space="preserve">—</w:t>
+      </w:r>
+      <w:r>
+        <w:t xml:space="preserve"> </w:t>
+      </w:r>
+      <w:r>
+        <w:rPr>
+          <w:b/>
+        </w:rPr>
+        <w:t xml:space="preserve">M1D11 Art Proof of Concept</w:t>
+      </w:r>
+      <w:r>
+        <w:t xml:space="preserve"> </w:t>
+      </w:r>
+      <w:r>
+        <w:t xml:space="preserve">(visual direction + 2 mockups) and</w:t>
+      </w:r>
+      <w:r>
+        <w:t xml:space="preserve"> </w:t>
+      </w:r>
+      <w:r>
+        <w:rPr>
+          <w:b/>
+        </w:rPr>
+        <w:t xml:space="preserve">M2D11 Art Implementation Quality</w:t>
+      </w:r>
+      <w:r>
+        <w:t xml:space="preserve"> </w:t>
+      </w:r>
+      <w:r>
+        <w:t xml:space="preserve">(all art in-engine, no placeholders), shown above as the last Design goal each milestone. Because the campus geometry is LiDAR-captured, the payload is style + iconography + UI rather than hand-modelled assets. Scope art hard, or add an artist within D+A ≤ 3.</w:t>
       </w:r>
     </w:p>
     <w:p>
@@ -3011,43 +3074,31 @@
         <w:rPr>
           <w:b/>
         </w:rPr>
-        <w:t xml:space="preserve">Art M2:</w:t>
-      </w:r>
-    </w:p>
-    <w:p>
-      <w:pPr>
-        <w:numPr>
-          <w:ilvl w:val="1"/>
-          <w:numId w:val="1023"/>
-        </w:numPr>
-        <w:pStyle w:val="Compact"/>
-      </w:pPr>
-      <w:r>
-        <w:t xml:space="preserve">M2A1 ⭐ Critical Asset Production &amp; In-Engine Visual Quality (the campus look, wayfinding icons and UI implemented and consistent)</w:t>
-      </w:r>
-    </w:p>
-    <w:p>
-      <w:pPr>
-        <w:numPr>
-          <w:ilvl w:val="1"/>
-          <w:numId w:val="1023"/>
-        </w:numPr>
-        <w:pStyle w:val="Compact"/>
-      </w:pPr>
-      <w:r>
-        <w:t xml:space="preserve">M2A3 Environment Alive — Ambient Animation &amp; Layering (lighting/ambient pass so the 3D campus reads clearly per floor)</w:t>
-      </w:r>
-    </w:p>
-    <w:p>
-      <w:pPr>
-        <w:numPr>
-          <w:ilvl w:val="1"/>
-          <w:numId w:val="1023"/>
-        </w:numPr>
-        <w:pStyle w:val="Compact"/>
-      </w:pPr>
-      <w:r>
-        <w:t xml:space="preserve">M2A4 UI Art — States &amp; Feedback (routing / rerouting / obstruction-reported / accessibility-mode states)</w:t>
+        <w:t xml:space="preserve">TEAM M1:</w:t>
+      </w:r>
+    </w:p>
+    <w:p>
+      <w:pPr>
+        <w:numPr>
+          <w:ilvl w:val="1"/>
+          <w:numId w:val="1022"/>
+        </w:numPr>
+        <w:pStyle w:val="Compact"/>
+      </w:pPr>
+      <w:r>
+        <w:t xml:space="preserve">M1TA1 ⭐ Overall Audio Experience — initial audio from the week-5 needs list present &amp; working (subtle ambient + UI/navigation cues: destination set, reroute, arrival), suitable and correctly triggered (a lecturer waiver on BGM may apply for this utility).</w:t>
+      </w:r>
+    </w:p>
+    <w:p>
+      <w:pPr>
+        <w:numPr>
+          <w:ilvl w:val="1"/>
+          <w:numId w:val="1022"/>
+        </w:numPr>
+        <w:pStyle w:val="Compact"/>
+      </w:pPr>
+      <w:r>
+        <w:t xml:space="preserve">M1TA2 ⭐ Audio Engine Functionality — data-driven audio pipeline (add/replace files without recompiling) + reliable multi-channel playback.</w:t>
       </w:r>
     </w:p>
     <w:p>
@@ -3062,45 +3113,6 @@
         <w:rPr>
           <w:b/>
         </w:rPr>
-        <w:t xml:space="preserve">TEAM M1:</w:t>
-      </w:r>
-    </w:p>
-    <w:p>
-      <w:pPr>
-        <w:numPr>
-          <w:ilvl w:val="1"/>
-          <w:numId w:val="1024"/>
-        </w:numPr>
-        <w:pStyle w:val="Compact"/>
-      </w:pPr>
-      <w:r>
-        <w:t xml:space="preserve">M1TA1 ⭐ Overall Audio Experience — initial audio from the week-5 needs list present &amp; working (subtle ambient + UI/navigation cues: destination set, reroute, arrival), suitable and correctly triggered (a lecturer waiver on BGM may apply for this utility).</w:t>
-      </w:r>
-    </w:p>
-    <w:p>
-      <w:pPr>
-        <w:numPr>
-          <w:ilvl w:val="1"/>
-          <w:numId w:val="1024"/>
-        </w:numPr>
-        <w:pStyle w:val="Compact"/>
-      </w:pPr>
-      <w:r>
-        <w:t xml:space="preserve">M1TA2 ⭐ Audio Engine Functionality — data-driven audio pipeline (add/replace files without recompiling) + reliable multi-channel playback.</w:t>
-      </w:r>
-    </w:p>
-    <w:p>
-      <w:pPr>
-        <w:numPr>
-          <w:ilvl w:val="0"/>
-          <w:numId w:val="1017"/>
-        </w:numPr>
-        <w:pStyle w:val="Compact"/>
-      </w:pPr>
-      <w:r>
-        <w:rPr>
-          <w:b/>
-        </w:rPr>
         <w:t xml:space="preserve">TEAM M2:</w:t>
       </w:r>
     </w:p>
@@ -3108,7 +3120,7 @@
       <w:pPr>
         <w:numPr>
           <w:ilvl w:val="1"/>
-          <w:numId w:val="1025"/>
+          <w:numId w:val="1023"/>
         </w:numPr>
         <w:pStyle w:val="Compact"/>
       </w:pPr>
@@ -3120,7 +3132,7 @@
       <w:pPr>
         <w:numPr>
           <w:ilvl w:val="1"/>
-          <w:numId w:val="1025"/>
+          <w:numId w:val="1023"/>
         </w:numPr>
         <w:pStyle w:val="Compact"/>
       </w:pPr>
@@ -3132,7 +3144,7 @@
       <w:pPr>
         <w:numPr>
           <w:ilvl w:val="1"/>
-          <w:numId w:val="1025"/>
+          <w:numId w:val="1023"/>
         </w:numPr>
         <w:pStyle w:val="Compact"/>
       </w:pPr>
@@ -3477,12 +3489,6 @@
     <w:abstractNumId w:val="991"/>
   </w:num>
   <w:num w:numId="1023">
-    <w:abstractNumId w:val="991"/>
-  </w:num>
-  <w:num w:numId="1024">
-    <w:abstractNumId w:val="991"/>
-  </w:num>
-  <w:num w:numId="1025">
     <w:abstractNumId w:val="991"/>
   </w:num>
 </w:numbering>

</xml_diff>